<commit_message>
Update combination report 3-6/3-8 with follow-up research findings
3-6 (Indian herb complex): cross-confirmed same 6-ingredient cluster in
VT코스메틱 and CosMedix(US) "Elite I-Complex", independent of Anua/d'Alba —
strengthens the single-raw-material hypothesis across 4 unrelated brands/2 countries.
3-8 (감초+황금): added KR100585444B1 patent precedent and literature on
Glycyrrhiza+Scutellaria synergistic anti-inflammatory effect (IL-8/PGE2
suppression). Confidence low~medium -> medium for both sections.
</commit_message>
<xml_diff>
--- a/data/olive_crwl/reports/ingredient_combination_analysis_report.docx
+++ b/data/olive_crwl/reports/ingredient_combination_analysis_report.docx
@@ -2258,11 +2258,22 @@
         <w:rPr>
           <w:rFonts w:ascii="맑은 고딕" w:hAnsi="맑은 고딕" w:eastAsia="맑은 고딕"/>
           <w:b w:val="0"/>
+          <w:i w:val="0"/>
+          <w:sz w:val="21"/>
+        </w:rPr>
+        <w:t>추가 검증(2026-07): 동일한 6종 조합이 VT코스메틱("VT 시카 더블 미스트")과 미국 브랜드 CosMedix("Elite I-Complex")에서도 100% 동일하게 발견됐다. CosMedix 제품에는 이 6종 외에도 Chlorella Vulgaris, Jasminum Sambac, Crataegus Monogyna, Laminaria Digitata 등 낯선 식물 추출물 10여 종이 같은 자리에 함께 등장한다. 아누아·달바·VT(한국)와 CosMedix(미국)까지 서로 무관한 4개 브랜드에서 동일 조합이 반복된다는 것은 각 브랜드가 독립적으로 이 조합을 설계했을 가능성을 더욱 낮추고, 원료사의 대형 멀티보태니컬 콤플렉스 원료 1개를 각 브랜드가 INCI로 풀어 쓴 것이라는 가설을 강하게 뒷받침한다. 다만 이번에도 정확한 원료 트레이드네임/공급사는 특정하지 못했다.</w:t>
+      </w:r>
+    </w:p>
+    <w:p>
+      <w:r>
+        <w:rPr>
+          <w:rFonts w:ascii="맑은 고딕" w:hAnsi="맑은 고딕" w:eastAsia="맑은 고딕"/>
+          <w:b w:val="0"/>
           <w:i/>
           <w:color w:val="5A5A5A"/>
           <w:sz w:val="19"/>
         </w:rPr>
-        <w:t>confidence: medium (패턴은 매우 강하지만 정확한 원료명 미확인 — 확인 필요)</w:t>
+        <w:t>confidence: medium (4개 브랜드·2개국에 걸친 동일 조합 재확인으로 '단일 원료' 가설의 근거는 강화됐으나, 정확한 원료명은 여전히 미확인 — 확인 필요)</w:t>
       </w:r>
     </w:p>
     <w:p>
@@ -2624,11 +2635,22 @@
         <w:rPr>
           <w:rFonts w:ascii="맑은 고딕" w:hAnsi="맑은 고딕" w:eastAsia="맑은 고딕"/>
           <w:b w:val="0"/>
+          <w:i w:val="0"/>
+          <w:sz w:val="21"/>
+        </w:rPr>
+        <w:t>추가 검증(2026-07): 국내 특허(KR100585444B1, 한방 약재를 이용한 피부노화 방지 및 여드름 개선용 화장료)에 감초와 황금이 다른 한방 약재들과 함께 실제 배합 처방으로 등장해, 전통 한방화장품에서 이 둘을 병용하는 것이 흔한 처방 패턴임을 확인했다. 학술 문헌상으로도 Glycyrrhiza glabra(감초)+Scutellaria baicalensis(황금) 조합이 IL-8·PGE2 등 염증 매개물질 억제에서 단독 대비 시너지 효과를 보인다는 보고가 있다. 즉 lift 수치 자체는 낮지만, 이는 우연한 동반 출현이 아니라 전통 처방과 과학적 근거가 뒷받침하는 의도된 조합으로 해석하는 것이 타당하다.</w:t>
+      </w:r>
+    </w:p>
+    <w:p>
+      <w:r>
+        <w:rPr>
+          <w:rFonts w:ascii="맑은 고딕" w:hAnsi="맑은 고딕" w:eastAsia="맑은 고딕"/>
+          <w:b w:val="0"/>
           <w:i/>
           <w:color w:val="5A5A5A"/>
           <w:sz w:val="19"/>
         </w:rPr>
-        <w:t>confidence: low~medium</w:t>
+        <w:t>confidence: medium (통계적 신호는 약하지만 전통 한방 처방 근거 및 문헌상 시너지 보고로 뒷받침됨)</w:t>
       </w:r>
     </w:p>
     <w:p>

</xml_diff>